<commit_message>
Changed the business card due to a problem
</commit_message>
<xml_diff>
--- a/Ekip_CodeAvengers_Sofia9/Ekip_CodeAvengers_Sofia9.docx
+++ b/Ekip_CodeAvengers_Sofia9/Ekip_CodeAvengers_Sofia9.docx
@@ -208,54 +208,6 @@
       <w:pPr>
         <w:spacing w:after="240" w:before="240" w:lineRule="auto"/>
         <w:rPr>
-          <w:color w:val="1155cc"/>
-          <w:sz w:val="24"/>
-          <w:szCs w:val="24"/>
-          <w:u w:val="single"/>
-        </w:rPr>
-      </w:pPr>
-      <w:r>
-        <w:rPr>
-          <w:b w:val="1"/>
-          <w:bCs w:val="1"/>
-          <w:sz w:val="24"/>
-          <w:szCs w:val="24"/>
-          <w:rtl w:val="0"/>
-        </w:rPr>
-        <w:t xml:space="preserve">Адрес на уебсайта:</w:t>
-      </w:r>
-      <w:hyperlink r:id="rId6">
-        <w:r>
-          <w:rPr>
-            <w:sz w:val="24"/>
-            <w:szCs w:val="24"/>
-            <w:rtl w:val="0"/>
-          </w:rPr>
-          <w:t xml:space="preserve"> </w:t>
-        </w:r>
-      </w:hyperlink>
-      <w:hyperlink r:id="rId7">
-        <w:r>
-          <w:rPr>
-            <w:color w:val="1155cc"/>
-            <w:sz w:val="24"/>
-            <w:szCs w:val="24"/>
-            <w:u w:val="single"/>
-            <w:rtl w:val="0"/>
-          </w:rPr>
-          <w:t xml:space="preserve">https://unesco.free.bg</w:t>
-        </w:r>
-      </w:hyperlink>
-      <w:r>
-        <w:rPr>
-          <w:rtl w:val="0"/>
-        </w:rPr>
-      </w:r>
-    </w:p>
-    <w:p>
-      <w:pPr>
-        <w:spacing w:after="240" w:before="240" w:lineRule="auto"/>
-        <w:rPr>
           <w:sz w:val="24"/>
           <w:szCs w:val="24"/>
         </w:rPr>
@@ -276,7 +228,7 @@
           <w:szCs w:val="24"/>
           <w:rtl w:val="0"/>
         </w:rPr>
-        <w:t xml:space="preserve">https://github.com/AdamBikov/UNESCO-Bulgaria</w:t>
+        <w:t xml:space="preserve">https://github.com/redjebb/UNESCO-Bulgaria</w:t>
       </w:r>
     </w:p>
     <w:p>

</xml_diff>